<commit_message>
Add the lab machine folder to the report
</commit_message>
<xml_diff>
--- a/report/project_report/MLOps_Assignment1_Report_2025ae05589.docx
+++ b/report/project_report/MLOps_Assignment1_Report_2025ae05589.docx
@@ -112,6 +112,24 @@
               </w:rPr>
               <w:t>Ashish Jain / 2025ae05589</w:t>
             </w:r>
+            <w:r>
+              <w:rPr>
+                <w:sz w:val="18"/>
+              </w:rPr>
+              <w:t xml:space="preserve"> (email: </w:t>
+            </w:r>
+            <w:r>
+              <w:rPr>
+                <w:sz w:val="18"/>
+              </w:rPr>
+              <w:t>2025ae05589</w:t>
+            </w:r>
+            <w:r>
+              <w:rPr>
+                <w:sz w:val="18"/>
+              </w:rPr>
+              <w:t>@wilp.bits-pilani.ac.in)</w:t>
+            </w:r>
           </w:p>
         </w:tc>
       </w:tr>
@@ -153,6 +171,43 @@
                 <w:t>https://github.com/2025ae05589/heart-disease-mlops</w:t>
               </w:r>
             </w:hyperlink>
+          </w:p>
+        </w:tc>
+      </w:tr>
+      <w:tr>
+        <w:trPr>
+          <w:jc w:val="center"/>
+        </w:trPr>
+        <w:tc>
+          <w:tcPr>
+            <w:tcW w:w="2268" w:type="dxa"/>
+          </w:tcPr>
+          <w:p>
+            <w:pPr>
+              <w:spacing w:after="0"/>
+            </w:pPr>
+            <w:r>
+              <w:rPr>
+                <w:sz w:val="18"/>
+              </w:rPr>
+              <w:t>Lab machine folder</w:t>
+            </w:r>
+          </w:p>
+        </w:tc>
+        <w:tc>
+          <w:tcPr>
+            <w:tcW w:w="7630" w:type="dxa"/>
+          </w:tcPr>
+          <w:p>
+            <w:pPr>
+              <w:spacing w:after="0"/>
+            </w:pPr>
+            <w:r>
+              <w:rPr>
+                <w:sz w:val="18"/>
+              </w:rPr>
+              <w:t>/home/s2025ae05589/workspace/Assignment_1/heart-disease-mlops</w:t>
+            </w:r>
           </w:p>
         </w:tc>
       </w:tr>
@@ -399,7 +454,7 @@
         </w:rPr>
         <w:drawing>
           <wp:inline distT="0" distB="0" distL="0" distR="0" wp14:anchorId="0A04A3DC" wp14:editId="6F0ED8F4">
-            <wp:extent cx="5580000" cy="3519692"/>
+            <wp:extent cx="5328000" cy="3360738"/>
             <wp:effectExtent l="0" t="0" r="0" b="0"/>
             <wp:docPr id="1" name="Picture 1"/>
             <wp:cNvGraphicFramePr>
@@ -421,7 +476,7 @@
                   <pic:spPr>
                     <a:xfrm>
                       <a:off x="0" y="0"/>
-                      <a:ext cx="5580000" cy="3519692"/>
+                      <a:ext cx="5328000" cy="3360738"/>
                     </a:xfrm>
                     <a:prstGeom prst="rect">
                       <a:avLst/>
@@ -3780,10 +3835,8 @@
     <w:p>
       <w:r>
         <w:lastRenderedPageBreak/>
-        <w:t xml:space="preserve">Gate 2 has been tested on the lab machine by running the pipeline a second time on the same data. The run produced the same model (Logistic Regression, C = 0.1, run ff3eaf25), registered as version 2, with the same test ROC-AUC of 0.965. As gate 2 requires a higher score than the champion, version 2 has not been promoted: it has kept the challenger alias with the tag failed_gate = gate 2, and version 1 has remained the champion served by the API. The runs, plots and registry history are shown in the screenshots linked below.</w:t>
-      </w:r>
-      <w:proofErr w:type="gramStart"/>
-      <w:proofErr w:type="gramEnd"/>
+        <w:t>Gate 2 has been tested on the lab machine by running the pipeline a second time on the same data. The run produced the same model (Logistic Regression, C = 0.1, run ff3eaf25), registered as version 2, with the same test ROC-AUC of 0.965. As gate 2 requires a higher score than the champion, version 2 has not been promoted: it has kept the challenger alias with the tag failed_gate = gate 2, and version 1 has remained the champion served by the API. The runs, plots and registry history are shown in the screenshots linked below.</w:t>
+      </w:r>
     </w:p>
     <w:p>
       <w:pPr>
@@ -8101,10 +8154,16 @@
         <w:t xml:space="preserve">Limitation: </w:t>
       </w:r>
       <w:r>
-        <w:t xml:space="preserve">Gate 2 compares each challenger with the champion on the same 61 test patients, on one metric (ROC-AUC) and without a margin. As more challengers are compared on these patients, one may win by chance (adaptive overfitting to the test set), and the small size makes the scores less stable.</w:t>
+        <w:t xml:space="preserve">Gate 2 compares each challenger with the champion on the same 61 test patients, on one metric (ROC-AUC) and without a margin. As more challengers are compared </w:t>
       </w:r>
       <w:proofErr w:type="gramStart"/>
+      <w:r>
+        <w:t>on</w:t>
+      </w:r>
       <w:proofErr w:type="gramEnd"/>
+      <w:r>
+        <w:t xml:space="preserve"> these patients, one may win by chance (adaptive overfitting to the test set), and the small size makes the scores less stable.</w:t>
+      </w:r>
     </w:p>
     <w:p>
       <w:pPr>
@@ -8118,7 +8177,7 @@
         <w:t xml:space="preserve">Reason: </w:t>
       </w:r>
       <w:r>
-        <w:t xml:space="preserve">The cause is the small, fixed dataset, not the champion-challenger design itself. No newly labelled patients are available, and with only 303 patients, setting aside a second test set would reduce the training data further.</w:t>
+        <w:t>The cause is the small, fixed dataset, not the champion-challenger design itself. No newly labelled patients are available, and with only 303 patients, setting aside a second test set would reduce the training data further.</w:t>
       </w:r>
     </w:p>
     <w:p>
@@ -8133,7 +8192,7 @@
         <w:t xml:space="preserve">Future mitigation: </w:t>
       </w:r>
       <w:r>
-        <w:t xml:space="preserve">The challenger and the champion would both be evaluated on the same newly labelled patients, with a predefined margin and a recall check. A shadow or canary comparison on live traffic would precede the switch, and a separate test set would be reserved for the final evaluation.</w:t>
+        <w:t>The challenger and the champion would both be evaluated on the same newly labelled patients, with a predefined margin and a recall check. A shadow or canary comparison on live traffic would precede the switch, and a separate test set would be reserved for the final evaluation.</w:t>
       </w:r>
     </w:p>
     <w:p>
@@ -8168,6 +8227,7 @@
         <w:rPr>
           <w:b/>
         </w:rPr>
+        <w:lastRenderedPageBreak/>
         <w:t xml:space="preserve">Small subgroups and weak features: </w:t>
       </w:r>
       <w:r>
@@ -8187,7 +8247,6 @@
         <w:rPr>
           <w:b/>
         </w:rPr>
-        <w:lastRenderedPageBreak/>
         <w:t>Production and operations</w:t>
       </w:r>
     </w:p>
@@ -8203,7 +8262,7 @@
         <w:t xml:space="preserve">No accuracy in production: </w:t>
       </w:r>
       <w:r>
-        <w:t xml:space="preserve">Accuracy cannot be measured in production, because the confirmed diagnosis of a patient is not sent back to the API. Only indirect signals are monitored: the missing fields, which describe the input, and the share of disease predictions and the confidence, which describe the model's output. These can hint at a change in the incoming patients but cannot show a drop in accuracy. In future, confirmed diagnoses could be matched to the logged predictions by request ID to track recall and accuracy, and the input values could be compared with the training data to detect drift.</w:t>
+        <w:t>Accuracy cannot be measured in production, because the confirmed diagnosis of a patient is not sent back to the API. Only indirect signals are monitored: the missing fields, which describe the input, and the share of disease predictions and the confidence, which describe the model's output. These can hint at a change in the incoming patients but cannot show a drop in accuracy. In future, confirmed diagnoses could be matched to the logged predictions by request ID to track recall and accuracy, and the input values could be compared with the training data to detect drift.</w:t>
       </w:r>
     </w:p>
     <w:p>
@@ -8269,10 +8328,8 @@
     </w:p>
     <w:p>
       <w:r>
-        <w:t xml:space="preserve">The notebook evaluates and reports, whereas the pipeline evaluates, enforces the gates and registers. A gate cell in a notebook can be skipped and its result depends on which cells were run, whereas the pipeline runs the same committed code locally and in CI, and each registered version records its git commit and data hash. This matches the common practice of automating the training pipeline rather than a single trained model (Google, MLOps level 1).</w:t>
-      </w:r>
-      <w:proofErr w:type="gramStart"/>
-      <w:proofErr w:type="gramEnd"/>
+        <w:t>The notebook evaluates and reports, whereas the pipeline evaluates, enforces the gates and registers. A gate cell in a notebook can be skipped and its result depends on which cells were run, whereas the pipeline runs the same committed code locally and in CI, and each registered version records its git commit and data hash. This matches the common practice of automating the training pipeline rather than a single trained model (Google, MLOps level 1).</w:t>
+      </w:r>
     </w:p>
     <w:p>
       <w:pPr>
@@ -8293,7 +8350,7 @@
         <w:spacing w:after="20"/>
       </w:pPr>
       <w:r>
-        <w:t xml:space="preserve">A changed hash indicates only that the file has changed, not that the data is valid, as it may be corrupt, in a new format or an error page.</w:t>
+        <w:t>A changed hash indicates only that the file has changed, not that the data is valid, as it may be corrupt, in a new format or an error page.</w:t>
       </w:r>
     </w:p>
     <w:p>
@@ -8302,7 +8359,7 @@
         <w:spacing w:after="20"/>
       </w:pPr>
       <w:r>
-        <w:t xml:space="preserve">New data may require a decision, such as allowing missing values in a new field.</w:t>
+        <w:t>New data may require a decision, such as allowing missing values in a new field.</w:t>
       </w:r>
     </w:p>
     <w:p>
@@ -8311,7 +8368,7 @@
         <w:spacing w:after="20"/>
       </w:pPr>
       <w:r>
-        <w:t xml:space="preserve">The gates check model scores, not data quality, and with new data the test set changes, so gate 2 would compare scores on different patients.</w:t>
+        <w:t>The gates check model scores, not data quality, and with new data the test set changes, so gate 2 would compare scores on different patients.</w:t>
       </w:r>
     </w:p>
     <w:p>
@@ -8320,7 +8377,7 @@
         <w:spacing w:after="20"/>
       </w:pPr>
       <w:r>
-        <w:t xml:space="preserve">The pipeline ends with deployment to GKE, so a faulty data file could reach the public API.</w:t>
+        <w:t>The pipeline ends with deployment to GKE, so a faulty data file could reach the public API.</w:t>
       </w:r>
     </w:p>
     <w:p>
@@ -8329,7 +8386,7 @@
         <w:spacing w:after="20"/>
       </w:pPr>
       <w:r>
-        <w:t xml:space="preserve">An automatic commit would need write access and a stored personal token, whereas the workflows are kept read-only and keyless.</w:t>
+        <w:t>An automatic commit would need write access and a stored personal token, whereas the workflows are kept read-only and keyless.</w:t>
       </w:r>
     </w:p>
     <w:p>

</xml_diff>